<commit_message>
Tách quản trị theo 3 mảng: quản trị nhân sự (A), tài khoản (B), danh mục (C); cập nhật BR-A09, A10, B10, C06, khảo sát, truy vết, ERD A, báo cáo (bảng tác nhân, RBAC)
Co-Authored-By: Claude Opus 5.5 <noreply@anthropic.com>
</commit_message>
<xml_diff>
--- a/docs/INT1313_TX_G5_DeTai05_Telemedicine_v2.1.docx
+++ b/docs/INT1313_TX_G5_DeTai05_Telemedicine_v2.1.docx
@@ -660,7 +660,7 @@
                 <w:sz w:val="22"/>
                 <w:szCs w:val="22"/>
               </w:rPr>
-              <w:t xml:space="preserve">Nhân viên và lịch làm việc: quản lý nhân viên (bác sĩ, lễ tân, quản trị); bác sĩ theo hai loại đa khoa, chuyên khoa; danh mục chuyên khoa; chứng chỉ hành nghề; xếp ca làm việc</w:t>
+              <w:t xml:space="preserve">Nhân viên và lịch làm việc: quản lý nhân viên (bác sĩ, lễ tân, ba loại quản trị); bác sĩ theo hai loại đa khoa, chuyên khoa; danh mục chuyên khoa; chứng chỉ hành nghề; xếp ca làm việc</w:t>
             </w:r>
           </w:p>
         </w:tc>
@@ -1322,7 +1322,7 @@
                 <w:sz w:val="22"/>
                 <w:szCs w:val="22"/>
               </w:rPr>
-              <w:t xml:space="preserve">Quản trị hệ thống</w:t>
+              <w:t xml:space="preserve">Quản trị nhân sự</w:t>
             </w:r>
           </w:p>
         </w:tc>
@@ -1346,7 +1346,7 @@
                 <w:sz w:val="22"/>
                 <w:szCs w:val="22"/>
               </w:rPr>
-              <w:t xml:space="preserve">Quản lý nhân viên, bác sĩ, chuyên khoa, ca làm việc, tài khoản và phân quyền</w:t>
+              <w:t xml:space="preserve">Quản lý nhân viên, bác sĩ, chuyên khoa, ca làm việc</w:t>
             </w:r>
           </w:p>
         </w:tc>
@@ -1370,7 +1370,161 @@
                 <w:sz w:val="22"/>
                 <w:szCs w:val="22"/>
               </w:rPr>
-              <w:t xml:space="preserve">Toàn quyền trên CSDL; xem báo cáo thống kê</w:t>
+              <w:t xml:space="preserve">Thêm, sửa nhân viên, bác sĩ, chuyên khoa, ca; xem báo cáo thống kê</w:t>
+            </w:r>
+          </w:p>
+        </w:tc>
+      </w:tr>
+      <w:tr>
+        <w:trPr>
+          <w:cantSplit/>
+        </w:trPr>
+        <w:tc>
+          <w:tcPr>
+            <w:tcW w:w="1758" w:type="dxa"/>
+          </w:tcPr>
+          <w:p>
+            <w:pPr>
+              <w:spacing w:before="20" w:after="20"/>
+              <w:jc w:val="left"/>
+              <w:rPr>
+                <w:rFonts w:ascii="Times New Roman" w:cs="Times New Roman" w:eastAsia="Times New Roman" w:hAnsi="Times New Roman"/>
+                <w:sz w:val="22"/>
+                <w:szCs w:val="22"/>
+              </w:rPr>
+            </w:pPr>
+            <w:r>
+              <w:rPr>
+                <w:rFonts w:ascii="Times New Roman" w:cs="Times New Roman" w:eastAsia="Times New Roman" w:hAnsi="Times New Roman"/>
+                <w:sz w:val="22"/>
+                <w:szCs w:val="22"/>
+              </w:rPr>
+              <w:t xml:space="preserve">Quản trị tài khoản</w:t>
+            </w:r>
+          </w:p>
+        </w:tc>
+        <w:tc>
+          <w:tcPr>
+            <w:tcW w:w="3516" w:type="dxa"/>
+          </w:tcPr>
+          <w:p>
+            <w:pPr>
+              <w:spacing w:before="20" w:after="20"/>
+              <w:jc w:val="left"/>
+              <w:rPr>
+                <w:rFonts w:ascii="Times New Roman" w:cs="Times New Roman" w:eastAsia="Times New Roman" w:hAnsi="Times New Roman"/>
+                <w:sz w:val="22"/>
+                <w:szCs w:val="22"/>
+              </w:rPr>
+            </w:pPr>
+            <w:r>
+              <w:rPr>
+                <w:rFonts w:ascii="Times New Roman" w:cs="Times New Roman" w:eastAsia="Times New Roman" w:hAnsi="Times New Roman"/>
+                <w:sz w:val="22"/>
+                <w:szCs w:val="22"/>
+              </w:rPr>
+              <w:t xml:space="preserve">Cấp, khóa, mở khóa tài khoản nhân viên; đổi vai trò</w:t>
+            </w:r>
+          </w:p>
+        </w:tc>
+        <w:tc>
+          <w:tcPr>
+            <w:tcW w:w="3516" w:type="dxa"/>
+          </w:tcPr>
+          <w:p>
+            <w:pPr>
+              <w:spacing w:before="20" w:after="20"/>
+              <w:jc w:val="left"/>
+              <w:rPr>
+                <w:rFonts w:ascii="Times New Roman" w:cs="Times New Roman" w:eastAsia="Times New Roman" w:hAnsi="Times New Roman"/>
+                <w:sz w:val="22"/>
+                <w:szCs w:val="22"/>
+              </w:rPr>
+            </w:pPr>
+            <w:r>
+              <w:rPr>
+                <w:rFonts w:ascii="Times New Roman" w:cs="Times New Roman" w:eastAsia="Times New Roman" w:hAnsi="Times New Roman"/>
+                <w:sz w:val="22"/>
+                <w:szCs w:val="22"/>
+              </w:rPr>
+              <w:t xml:space="preserve">Thêm, sửa tài khoản nhân viên; không xem bệnh án</w:t>
+            </w:r>
+          </w:p>
+        </w:tc>
+      </w:tr>
+      <w:tr>
+        <w:trPr>
+          <w:cantSplit/>
+        </w:trPr>
+        <w:tc>
+          <w:tcPr>
+            <w:tcW w:w="1758" w:type="dxa"/>
+          </w:tcPr>
+          <w:p>
+            <w:pPr>
+              <w:spacing w:before="20" w:after="20"/>
+              <w:jc w:val="left"/>
+              <w:rPr>
+                <w:rFonts w:ascii="Times New Roman" w:cs="Times New Roman" w:eastAsia="Times New Roman" w:hAnsi="Times New Roman"/>
+                <w:sz w:val="22"/>
+                <w:szCs w:val="22"/>
+              </w:rPr>
+            </w:pPr>
+            <w:r>
+              <w:rPr>
+                <w:rFonts w:ascii="Times New Roman" w:cs="Times New Roman" w:eastAsia="Times New Roman" w:hAnsi="Times New Roman"/>
+                <w:sz w:val="22"/>
+                <w:szCs w:val="22"/>
+              </w:rPr>
+              <w:t xml:space="preserve">Quản trị danh mục</w:t>
+            </w:r>
+          </w:p>
+        </w:tc>
+        <w:tc>
+          <w:tcPr>
+            <w:tcW w:w="3516" w:type="dxa"/>
+          </w:tcPr>
+          <w:p>
+            <w:pPr>
+              <w:spacing w:before="20" w:after="20"/>
+              <w:jc w:val="left"/>
+              <w:rPr>
+                <w:rFonts w:ascii="Times New Roman" w:cs="Times New Roman" w:eastAsia="Times New Roman" w:hAnsi="Times New Roman"/>
+                <w:sz w:val="22"/>
+                <w:szCs w:val="22"/>
+              </w:rPr>
+            </w:pPr>
+            <w:r>
+              <w:rPr>
+                <w:rFonts w:ascii="Times New Roman" w:cs="Times New Roman" w:eastAsia="Times New Roman" w:hAnsi="Times New Roman"/>
+                <w:sz w:val="22"/>
+                <w:szCs w:val="22"/>
+              </w:rPr>
+              <w:t xml:space="preserve">Quản lý danh mục thuốc, hoạt chất, ICD-10</w:t>
+            </w:r>
+          </w:p>
+        </w:tc>
+        <w:tc>
+          <w:tcPr>
+            <w:tcW w:w="3516" w:type="dxa"/>
+          </w:tcPr>
+          <w:p>
+            <w:pPr>
+              <w:spacing w:before="20" w:after="20"/>
+              <w:jc w:val="left"/>
+              <w:rPr>
+                <w:rFonts w:ascii="Times New Roman" w:cs="Times New Roman" w:eastAsia="Times New Roman" w:hAnsi="Times New Roman"/>
+                <w:sz w:val="22"/>
+                <w:szCs w:val="22"/>
+              </w:rPr>
+            </w:pPr>
+            <w:r>
+              <w:rPr>
+                <w:rFonts w:ascii="Times New Roman" w:cs="Times New Roman" w:eastAsia="Times New Roman" w:hAnsi="Times New Roman"/>
+                <w:sz w:val="22"/>
+                <w:szCs w:val="22"/>
+              </w:rPr>
+              <w:t xml:space="preserve">Thêm, sửa danh mục; không xem bệnh án</w:t>
             </w:r>
           </w:p>
         </w:tc>
@@ -2696,7 +2850,7 @@
                 <w:sz w:val="22"/>
                 <w:szCs w:val="22"/>
               </w:rPr>
-              <w:t xml:space="preserve">Có 4 vai trò (quản trị, bác sĩ, lễ tân, bệnh nhân); thao tác ngoài quyền bị CSDL từ chối</w:t>
+              <w:t xml:space="preserve">Có 6 vai trò (quản trị nhân sự, quản trị tài khoản, quản trị danh mục, bác sĩ, lễ tân, bệnh nhân); thao tác ngoài quyền bị CSDL từ chối</w:t>
             </w:r>
           </w:p>
         </w:tc>
@@ -3694,7 +3848,7 @@
                 <w:sz w:val="22"/>
                 <w:szCs w:val="22"/>
               </w:rPr>
-              <w:t xml:space="preserve">Chỉ quản trị được thêm, sửa nhân viên, bác sĩ, chuyên khoa và ca làm việc; bác sĩ và lễ tân chỉ được xem</w:t>
+              <w:t xml:space="preserve">Chỉ quản trị nhân sự được thêm, sửa nhân viên, bác sĩ, chuyên khoa và ca làm việc; bác sĩ và lễ tân chỉ được xem</w:t>
             </w:r>
           </w:p>
         </w:tc>
@@ -3771,7 +3925,7 @@
                 <w:sz w:val="22"/>
                 <w:szCs w:val="22"/>
               </w:rPr>
-              <w:t xml:space="preserve">Mỗi nhân viên thuộc đúng một loại: bác sĩ, lễ tân hoặc quản trị; chỉ nhân viên loại bác sĩ mới có thông tin bác sĩ</w:t>
+              <w:t xml:space="preserve">Mỗi nhân viên thuộc đúng một loại: bác sĩ, lễ tân, quản trị nhân sự, quản trị tài khoản hoặc quản trị danh mục; chỉ nhân viên loại bác sĩ mới có thông tin bác sĩ</w:t>
             </w:r>
           </w:p>
         </w:tc>
@@ -4683,7 +4837,7 @@
                 <w:sz w:val="22"/>
                 <w:szCs w:val="22"/>
               </w:rPr>
-              <w:t xml:space="preserve">Chỉ quản trị được tạo tài khoản nhân viên, đổi vai trò và khóa, mở khóa tài khoản; lễ tân chỉ được tạo tài khoản bệnh nhân và đặt lại mật khẩu cho tài khoản bệnh nhân; mỗi người chỉ đổi được mật khẩu của chính mình; tài khoản không bị xóa</w:t>
+              <w:t xml:space="preserve">Chỉ quản trị tài khoản được tạo tài khoản nhân viên, đổi vai trò và khóa, mở khóa tài khoản; lễ tân chỉ được tạo tài khoản bệnh nhân và đặt lại mật khẩu cho tài khoản bệnh nhân; mỗi người chỉ đổi được mật khẩu của chính mình; tài khoản không bị xóa</w:t>
             </w:r>
           </w:p>
         </w:tc>
@@ -5287,7 +5441,7 @@
                 <w:sz w:val="22"/>
                 <w:szCs w:val="22"/>
               </w:rPr>
-              <w:t xml:space="preserve">Chỉ bác sĩ được ghi lần khám, chẩn đoán, đơn thuốc và dị ứng; lễ tân không được xem các dữ liệu này; bệnh nhân chỉ được xem bệnh án của chính mình</w:t>
+              <w:t xml:space="preserve">Chỉ bác sĩ được ghi lần khám, chẩn đoán, đơn thuốc và dị ứng; lễ tân không được xem các dữ liệu này; bệnh nhân chỉ được xem bệnh án của chính mình; chỉ quản trị danh mục được thêm, sửa thuốc, hoạt chất và mã ICD-10</w:t>
             </w:r>
           </w:p>
         </w:tc>
@@ -5760,7 +5914,7 @@
                 <w:sz w:val="22"/>
                 <w:szCs w:val="22"/>
               </w:rPr>
-              <w:t xml:space="preserve">Người làm việc tại phòng khám: bác sĩ, lễ tân, quản trị; lớp cha phân theo loại nhân viên</w:t>
+              <w:t xml:space="preserve">Người làm việc tại phòng khám: bác sĩ, lễ tân, quản trị nhân sự, quản trị tài khoản, quản trị danh mục; lớp cha phân theo loại nhân viên</w:t>
             </w:r>
           </w:p>
         </w:tc>
@@ -7135,7 +7289,7 @@
                 <w:sz w:val="22"/>
                 <w:szCs w:val="22"/>
               </w:rPr>
-              <w:t xml:space="preserve">Tài khoản đăng nhập của người dùng, mang đúng một vai trò: quản trị, bác sĩ, lễ tân, bệnh nhân</w:t>
+              <w:t xml:space="preserve">Tài khoản đăng nhập của người dùng, mang đúng một vai trò: quản trị nhân sự, quản trị tài khoản, quản trị danh mục, bác sĩ, lễ tân, bệnh nhân</w:t>
             </w:r>
           </w:p>
         </w:tc>
@@ -12973,7 +13127,7 @@
         <w:rPr>
           <w:rFonts w:ascii="Times New Roman" w:cs="Times New Roman" w:eastAsia="Times New Roman" w:hAnsi="Times New Roman"/>
         </w:rPr>
-        <w:t xml:space="preserve">– Quản lý nhân viên gồm bác sĩ, lễ tân, quản trị; điều dưỡng không lưu trong CSDL. Lễ tân, quản trị chỉ ở lớp cha NHAN_VIEN vì không có thuộc tính, liên kết riêng; BAC_SI kế thừa khóa ma_nv. Vai trò không phải kiểu thực thể mà là thuộc tính vai_tro của TAI_KHOAN; quyền của từng vai trò không mô hình hóa trên ERD. Lễ tân tạo tài khoản bệnh nhân khi tiếp nhận, quản trị quản lý tài khoản nhân viên; tài khoản chỉ khóa, không xóa.</w:t>
+        <w:t xml:space="preserve">– Quản lý nhân viên gồm bác sĩ, lễ tân và ba loại quản trị theo mảng (nhân sự – A, tài khoản – B, danh mục – C); điều dưỡng không lưu trong CSDL. Lễ tân, quản trị chỉ ở lớp cha NHAN_VIEN vì không có thuộc tính, liên kết riêng; BAC_SI kế thừa khóa ma_nv. Vai trò không phải kiểu thực thể mà là thuộc tính vai_tro của TAI_KHOAN; quyền của từng vai trò không mô hình hóa trên ERD. Lễ tân tạo tài khoản bệnh nhân khi tiếp nhận, quản trị tài khoản quản lý tài khoản nhân viên; tài khoản chỉ khóa, không xóa.</w:t>
       </w:r>
     </w:p>
     <w:p>
@@ -24092,7 +24246,7 @@
                 <w:sz w:val="22"/>
                 <w:szCs w:val="22"/>
               </w:rPr>
-              <w:t xml:space="preserve">r_quan_tri</w:t>
+              <w:t xml:space="preserve">r_qt_nhan_su</w:t>
             </w:r>
           </w:p>
         </w:tc>
@@ -24119,7 +24273,7 @@
                 <w:sz w:val="22"/>
                 <w:szCs w:val="22"/>
               </w:rPr>
-              <w:t xml:space="preserve">Quản trị hệ thống</w:t>
+              <w:t xml:space="preserve">Quản trị nhân sự</w:t>
             </w:r>
           </w:p>
         </w:tc>
@@ -24146,7 +24300,7 @@
                 <w:sz w:val="22"/>
                 <w:szCs w:val="22"/>
               </w:rPr>
-              <w:t xml:space="preserve">Toàn quyền trên schema; tạo tài khoản nhân viên, đổi vai trò, khóa tài khoản</w:t>
+              <w:t xml:space="preserve">SELECT, INSERT, UPDATE nhân viên, bác sĩ, chuyên khoa, ca làm việc</w:t>
             </w:r>
           </w:p>
         </w:tc>
@@ -24173,7 +24327,233 @@
                 <w:sz w:val="22"/>
                 <w:szCs w:val="22"/>
               </w:rPr>
-              <w:t xml:space="preserve">DELETE trên TAI_KHOAN</w:t>
+              <w:t xml:space="preserve">Mọi quyền trên bệnh án, tài khoản, danh mục</w:t>
+            </w:r>
+          </w:p>
+        </w:tc>
+      </w:tr>
+      <w:tr>
+        <w:trPr>
+          <w:cantSplit/>
+        </w:trPr>
+        <w:tc>
+          <w:tcPr>
+            <w:tcW w:w="1590" w:type="dxa"/>
+          </w:tcPr>
+          <w:p>
+            <w:pPr>
+              <w:spacing w:before="20" w:after="20"/>
+              <w:jc w:val="left"/>
+              <w:rPr>
+                <w:rFonts w:ascii="Times New Roman" w:cs="Times New Roman" w:eastAsia="Times New Roman" w:hAnsi="Times New Roman"/>
+                <w:i w:val="1"/>
+                <w:iCs w:val="1"/>
+                <w:color w:val="7F7F7F"/>
+                <w:sz w:val="22"/>
+                <w:szCs w:val="22"/>
+              </w:rPr>
+            </w:pPr>
+            <w:r>
+              <w:rPr>
+                <w:rFonts w:ascii="Times New Roman" w:cs="Times New Roman" w:eastAsia="Times New Roman" w:hAnsi="Times New Roman"/>
+                <w:sz w:val="22"/>
+                <w:szCs w:val="22"/>
+              </w:rPr>
+              <w:t xml:space="preserve">r_qt_tai_khoan</w:t>
+            </w:r>
+          </w:p>
+        </w:tc>
+        <w:tc>
+          <w:tcPr>
+            <w:tcW w:w="1496" w:type="dxa"/>
+          </w:tcPr>
+          <w:p>
+            <w:pPr>
+              <w:spacing w:before="20" w:after="20"/>
+              <w:jc w:val="left"/>
+              <w:rPr>
+                <w:rFonts w:ascii="Times New Roman" w:cs="Times New Roman" w:eastAsia="Times New Roman" w:hAnsi="Times New Roman"/>
+                <w:i w:val="1"/>
+                <w:iCs w:val="1"/>
+                <w:color w:val="7F7F7F"/>
+                <w:sz w:val="22"/>
+                <w:szCs w:val="22"/>
+              </w:rPr>
+            </w:pPr>
+            <w:r>
+              <w:rPr>
+                <w:rFonts w:ascii="Times New Roman" w:cs="Times New Roman" w:eastAsia="Times New Roman" w:hAnsi="Times New Roman"/>
+                <w:sz w:val="22"/>
+                <w:szCs w:val="22"/>
+              </w:rPr>
+              <w:t xml:space="preserve">Quản trị tài khoản</w:t>
+            </w:r>
+          </w:p>
+        </w:tc>
+        <w:tc>
+          <w:tcPr>
+            <w:tcW w:w="3086" w:type="dxa"/>
+          </w:tcPr>
+          <w:p>
+            <w:pPr>
+              <w:spacing w:before="20" w:after="20"/>
+              <w:jc w:val="left"/>
+              <w:rPr>
+                <w:rFonts w:ascii="Times New Roman" w:cs="Times New Roman" w:eastAsia="Times New Roman" w:hAnsi="Times New Roman"/>
+                <w:i w:val="1"/>
+                <w:iCs w:val="1"/>
+                <w:color w:val="7F7F7F"/>
+                <w:sz w:val="22"/>
+                <w:szCs w:val="22"/>
+              </w:rPr>
+            </w:pPr>
+            <w:r>
+              <w:rPr>
+                <w:rFonts w:ascii="Times New Roman" w:cs="Times New Roman" w:eastAsia="Times New Roman" w:hAnsi="Times New Roman"/>
+                <w:sz w:val="22"/>
+                <w:szCs w:val="22"/>
+              </w:rPr>
+              <w:t xml:space="preserve">SELECT nhân viên; SELECT, INSERT, UPDATE tài khoản nhân viên (tạo, đổi vai trò, khóa, mở khóa)</w:t>
+            </w:r>
+          </w:p>
+        </w:tc>
+        <w:tc>
+          <w:tcPr>
+            <w:tcW w:w="2618" w:type="dxa"/>
+          </w:tcPr>
+          <w:p>
+            <w:pPr>
+              <w:spacing w:before="20" w:after="20"/>
+              <w:jc w:val="left"/>
+              <w:rPr>
+                <w:rFonts w:ascii="Times New Roman" w:cs="Times New Roman" w:eastAsia="Times New Roman" w:hAnsi="Times New Roman"/>
+                <w:i w:val="1"/>
+                <w:iCs w:val="1"/>
+                <w:color w:val="7F7F7F"/>
+                <w:sz w:val="22"/>
+                <w:szCs w:val="22"/>
+              </w:rPr>
+            </w:pPr>
+            <w:r>
+              <w:rPr>
+                <w:rFonts w:ascii="Times New Roman" w:cs="Times New Roman" w:eastAsia="Times New Roman" w:hAnsi="Times New Roman"/>
+                <w:sz w:val="22"/>
+                <w:szCs w:val="22"/>
+              </w:rPr>
+              <w:t xml:space="preserve">DELETE trên TAI_KHOAN; mọi quyền trên bệnh án</w:t>
+            </w:r>
+          </w:p>
+        </w:tc>
+      </w:tr>
+      <w:tr>
+        <w:trPr>
+          <w:cantSplit/>
+        </w:trPr>
+        <w:tc>
+          <w:tcPr>
+            <w:tcW w:w="1590" w:type="dxa"/>
+          </w:tcPr>
+          <w:p>
+            <w:pPr>
+              <w:spacing w:before="20" w:after="20"/>
+              <w:jc w:val="left"/>
+              <w:rPr>
+                <w:rFonts w:ascii="Times New Roman" w:cs="Times New Roman" w:eastAsia="Times New Roman" w:hAnsi="Times New Roman"/>
+                <w:i w:val="1"/>
+                <w:iCs w:val="1"/>
+                <w:color w:val="7F7F7F"/>
+                <w:sz w:val="22"/>
+                <w:szCs w:val="22"/>
+              </w:rPr>
+            </w:pPr>
+            <w:r>
+              <w:rPr>
+                <w:rFonts w:ascii="Times New Roman" w:cs="Times New Roman" w:eastAsia="Times New Roman" w:hAnsi="Times New Roman"/>
+                <w:sz w:val="22"/>
+                <w:szCs w:val="22"/>
+              </w:rPr>
+              <w:t xml:space="preserve">r_qt_danh_muc</w:t>
+            </w:r>
+          </w:p>
+        </w:tc>
+        <w:tc>
+          <w:tcPr>
+            <w:tcW w:w="1496" w:type="dxa"/>
+          </w:tcPr>
+          <w:p>
+            <w:pPr>
+              <w:spacing w:before="20" w:after="20"/>
+              <w:jc w:val="left"/>
+              <w:rPr>
+                <w:rFonts w:ascii="Times New Roman" w:cs="Times New Roman" w:eastAsia="Times New Roman" w:hAnsi="Times New Roman"/>
+                <w:i w:val="1"/>
+                <w:iCs w:val="1"/>
+                <w:color w:val="7F7F7F"/>
+                <w:sz w:val="22"/>
+                <w:szCs w:val="22"/>
+              </w:rPr>
+            </w:pPr>
+            <w:r>
+              <w:rPr>
+                <w:rFonts w:ascii="Times New Roman" w:cs="Times New Roman" w:eastAsia="Times New Roman" w:hAnsi="Times New Roman"/>
+                <w:sz w:val="22"/>
+                <w:szCs w:val="22"/>
+              </w:rPr>
+              <w:t xml:space="preserve">Quản trị danh mục</w:t>
+            </w:r>
+          </w:p>
+        </w:tc>
+        <w:tc>
+          <w:tcPr>
+            <w:tcW w:w="3086" w:type="dxa"/>
+          </w:tcPr>
+          <w:p>
+            <w:pPr>
+              <w:spacing w:before="20" w:after="20"/>
+              <w:jc w:val="left"/>
+              <w:rPr>
+                <w:rFonts w:ascii="Times New Roman" w:cs="Times New Roman" w:eastAsia="Times New Roman" w:hAnsi="Times New Roman"/>
+                <w:i w:val="1"/>
+                <w:iCs w:val="1"/>
+                <w:color w:val="7F7F7F"/>
+                <w:sz w:val="22"/>
+                <w:szCs w:val="22"/>
+              </w:rPr>
+            </w:pPr>
+            <w:r>
+              <w:rPr>
+                <w:rFonts w:ascii="Times New Roman" w:cs="Times New Roman" w:eastAsia="Times New Roman" w:hAnsi="Times New Roman"/>
+                <w:sz w:val="22"/>
+                <w:szCs w:val="22"/>
+              </w:rPr>
+              <w:t xml:space="preserve">SELECT, INSERT, UPDATE thuốc, hoạt chất, mã ICD-10</w:t>
+            </w:r>
+          </w:p>
+        </w:tc>
+        <w:tc>
+          <w:tcPr>
+            <w:tcW w:w="2618" w:type="dxa"/>
+          </w:tcPr>
+          <w:p>
+            <w:pPr>
+              <w:spacing w:before="20" w:after="20"/>
+              <w:jc w:val="left"/>
+              <w:rPr>
+                <w:rFonts w:ascii="Times New Roman" w:cs="Times New Roman" w:eastAsia="Times New Roman" w:hAnsi="Times New Roman"/>
+                <w:i w:val="1"/>
+                <w:iCs w:val="1"/>
+                <w:color w:val="7F7F7F"/>
+                <w:sz w:val="22"/>
+                <w:szCs w:val="22"/>
+              </w:rPr>
+            </w:pPr>
+            <w:r>
+              <w:rPr>
+                <w:rFonts w:ascii="Times New Roman" w:cs="Times New Roman" w:eastAsia="Times New Roman" w:hAnsi="Times New Roman"/>
+                <w:sz w:val="22"/>
+                <w:szCs w:val="22"/>
+              </w:rPr>
+              <w:t xml:space="preserve">Mọi quyền trên bệnh án, tài khoản</w:t>
             </w:r>
           </w:p>
         </w:tc>

</xml_diff>